<commit_message>
Supplementals added and index update
</commit_message>
<xml_diff>
--- a/gse-transcripts/GSE_Court_Reporting_Day_09_October_22_2026.docx
+++ b/gse-transcripts/GSE_Court_Reporting_Day_09_October_22_2026.docx
@@ -12880,20 +12880,260 @@
     <w:p>
       <w:pPr>
         <w:pStyle w:val="Heading1"/>
+        <w:keepNext/>
+      </w:pPr>
+      <w:r>
+        <w:rPr/>
+        <w:t xml:space="preserve">Supplemental Reporting¹</w:t>
+      </w:r>
+    </w:p>
+    <w:p>
+      <w:pPr>
+        <w:pStyle w:val="Normal"/>
+        <w:spacing w:after="160"/>
+      </w:pPr>
+      <w:r>
+        <w:rPr>
+          <w:i/>
+        </w:rPr>
+        <w:t xml:space="preserve">Notes by </w:t>
+      </w:r>
+      <w:hyperlink r:id="rId279">
+        <w:r>
+          <w:rPr>
+            <w:color w:val="0563C1"/>
+            <w:u w:val="single"/>
+            <w:i/>
+          </w:rPr>
+          <w:t xml:space="preserve">Kristina Rex</w:t>
+        </w:r>
+      </w:hyperlink>
+      <w:r>
+        <w:rPr>
+          <w:i/>
+        </w:rPr>
+        <w:t xml:space="preserve"> · contemporaneous courtroom reporting by </w:t>
+      </w:r>
+      <w:hyperlink r:id="rId280">
+        <w:r>
+          <w:rPr>
+            <w:color w:val="0563C1"/>
+            <w:u w:val="single"/>
+            <w:i/>
+          </w:rPr>
+          <w:t xml:space="preserve">Ryan Breslin</w:t>
+        </w:r>
+      </w:hyperlink>
+    </w:p>
+    <w:p>
+      <w:pPr>
+        <w:pStyle w:val="Heading1"/>
+        <w:keepNext/>
+      </w:pPr>
+      <w:r>
+        <w:rPr/>
+        <w:t xml:space="preserve">Witness #29 — Samantha McCue</w:t>
+      </w:r>
+    </w:p>
+    <w:p>
+      <w:pPr>
+        <w:pStyle w:val="Heading2"/>
+        <w:keepNext/>
+      </w:pPr>
+      <w:r>
+        <w:rPr/>
+        <w:t xml:space="preserve">Direct examination — reported testimony</w:t>
+      </w:r>
+    </w:p>
+    <w:p>
+      <w:pPr>
+        <w:pStyle w:val="Normal"/>
+      </w:pPr>
+      <w:r>
+        <w:rPr/>
+        <w:t xml:space="preserve">Background. McCue said she grew up in Canton and Stoughton and met Matthew Farwell through the Stoughton Police Explorers program. Their relationship became sexual in 2012, when she was 22. Farwell was then dating Michelle, whom he later married.</w:t>
+      </w:r>
+    </w:p>
+    <w:p>
+      <w:pPr>
+        <w:pStyle w:val="Normal"/>
+      </w:pPr>
+      <w:r>
+        <w:rPr/>
+        <w:t xml:space="preserve">Location and concealment. McCue reported that sexual encounters occurred at the home Farwell shared with Michelle when nobody else was present. Asked whether Farwell wore a mask or any disguise, she answered no.</w:t>
+      </w:r>
+    </w:p>
+    <w:p>
+      <w:pPr>
+        <w:pStyle w:val="Heading2"/>
+        <w:keepNext/>
+      </w:pPr>
+      <w:r>
+        <w:rPr/>
+        <w:t xml:space="preserve">Cross-examination — reported testimony</w:t>
+      </w:r>
+    </w:p>
+    <w:p>
+      <w:pPr>
+        <w:pStyle w:val="Normal"/>
+      </w:pPr>
+      <w:r>
+        <w:rPr/>
+        <w:t xml:space="preserve">Consent and secrecy. Breslin reported a two-question defense cross-examination: McCue confirmed the 2012 relationship was between consenting adults and agreed neither participant wanted it known.</w:t>
+      </w:r>
+    </w:p>
+    <w:p>
+      <w:pPr>
+        <w:pStyle w:val="Heading1"/>
+        <w:keepNext/>
+      </w:pPr>
+      <w:r>
+        <w:rPr/>
+        <w:t xml:space="preserve">Witness #30 — Sheanna Isabel Zbinski</w:t>
+      </w:r>
+    </w:p>
+    <w:p>
+      <w:pPr>
+        <w:pStyle w:val="Heading2"/>
+        <w:keepNext/>
+      </w:pPr>
+      <w:r>
+        <w:rPr/>
+        <w:t xml:space="preserve">Direct examination — reported testimony</w:t>
+      </w:r>
+    </w:p>
+    <w:p>
+      <w:pPr>
+        <w:pStyle w:val="Normal"/>
+      </w:pPr>
+      <w:r>
+        <w:rPr/>
+        <w:t xml:space="preserve">Police employment and relationship. Zbinski said she met Farwell while working as a Stoughton police officer; Rex’s notes place the start of her service in 2011. Their relationship became sexual in 2016 and lasted approximately a year. Farwell was married at the time.</w:t>
+      </w:r>
+    </w:p>
+    <w:p>
+      <w:pPr>
+        <w:pStyle w:val="Normal"/>
+      </w:pPr>
+      <w:r>
+        <w:rPr/>
+        <w:t xml:space="preserve">Messages and concealment. The notes report that Farwell did not tell Zbinski to delete text messages and did not wear a disguise. Questions about whether he wore a mask were recorded, but the notes do not preserve a clear answer to that question.</w:t>
+      </w:r>
+    </w:p>
+    <w:p>
+      <w:pPr>
+        <w:pStyle w:val="Heading2"/>
+        <w:keepNext/>
+      </w:pPr>
+      <w:r>
+        <w:rPr/>
+        <w:t xml:space="preserve">Cross-examination — reported testimony</w:t>
+      </w:r>
+    </w:p>
+    <w:p>
+      <w:pPr>
+        <w:pStyle w:val="Normal"/>
+      </w:pPr>
+      <w:r>
+        <w:rPr/>
+        <w:t xml:space="preserve">Consent and meeting place. Zbinski agreed that the relationship involved consenting adults and that neither wanted others to learn about it. She said they met in Brockton to avoid being recognized.</w:t>
+      </w:r>
+    </w:p>
+    <w:p>
+      <w:pPr>
+        <w:pStyle w:val="Heading2"/>
+        <w:keepNext/>
+      </w:pPr>
+      <w:r>
+        <w:rPr/>
+        <w:t xml:space="preserve">Redirect — reported testimony</w:t>
+      </w:r>
+    </w:p>
+    <w:p>
+      <w:pPr>
+        <w:pStyle w:val="Normal"/>
+      </w:pPr>
+      <w:r>
+        <w:rPr/>
+        <w:t xml:space="preserve">Geography. Zbinski confirmed that Brockton borders Stoughton.</w:t>
+      </w:r>
+    </w:p>
+    <w:p>
+      <w:pPr>
+        <w:pStyle w:val="Normal"/>
+        <w:spacing w:before="100" w:after="240"/>
+      </w:pPr>
+      <w:r>
+        <w:rPr>
+          <w:i/>
+        </w:rPr>
+        <w:t xml:space="preserve">Sources: </w:t>
+      </w:r>
+      <w:hyperlink r:id="rId279">
+        <w:r>
+          <w:rPr>
+            <w:color w:val="0563C1"/>
+            <w:u w:val="single"/>
+            <w:i/>
+          </w:rPr>
+          <w:t xml:space="preserve">Rex notes</w:t>
+        </w:r>
+      </w:hyperlink>
+      <w:r>
+        <w:rPr>
+          <w:i/>
+        </w:rPr>
+        <w:t xml:space="preserve"> · </w:t>
+      </w:r>
+      <w:hyperlink r:id="rId281">
+        <w:r>
+          <w:rPr>
+            <w:color w:val="0563C1"/>
+            <w:u w:val="single"/>
+            <w:i/>
+          </w:rPr>
+          <w:t xml:space="preserve">Breslin — McCue</w:t>
+        </w:r>
+      </w:hyperlink>
+      <w:r>
+        <w:rPr>
+          <w:i/>
+        </w:rPr>
+        <w:t xml:space="preserve"> · </w:t>
+      </w:r>
+      <w:hyperlink r:id="rId282">
+        <w:r>
+          <w:rPr>
+            <w:color w:val="0563C1"/>
+            <w:u w:val="single"/>
+            <w:i/>
+          </w:rPr>
+          <w:t xml:space="preserve">Breslin — McCue cross</w:t>
+        </w:r>
+      </w:hyperlink>
+      <w:r>
+        <w:rPr>
+          <w:i/>
+        </w:rPr>
+        <w:t xml:space="preserve"> · </w:t>
+      </w:r>
+      <w:hyperlink r:id="rId283">
+        <w:r>
+          <w:rPr>
+            <w:color w:val="0563C1"/>
+            <w:u w:val="single"/>
+            <w:i/>
+          </w:rPr>
+          <w:t xml:space="preserve">Breslin — Zbinski</w:t>
+        </w:r>
+      </w:hyperlink>
+    </w:p>
+    <w:p>
+      <w:pPr>
+        <w:pStyle w:val="Heading1"/>
       </w:pPr>
       <w:r>
         <w:t>Ms. Duvall - Massachusetts State Police Crime Lab</w:t>
-      </w:r>
-    </w:p>
-    <w:p>
-      <w:r>
-        <w:rPr>
-          <w:b/>
-        </w:rPr>
-        <w:t xml:space="preserve">Editorial note: </w:t>
-      </w:r>
-      <w:r>
-        <w:t>Grant had stepped away while Jason Pickard exited the courthouse and returned with the MSP crime-lab witness already testifying. The retrieved corpus identifies the witness as Ms. Duvall; no separate Grant-authored witness-introduction post was retrieved.</w:t>
       </w:r>
     </w:p>
     <w:tbl>
@@ -21906,6 +22146,24 @@
           <w:i/>
         </w:rPr>
         <w:t>All donations go directly to Grant Smith Ellis; this archive is unaffiliated with and receives no proceeds from them.</w:t>
+      </w:r>
+    </w:p>
+    <w:p>
+      <w:pPr>
+        <w:spacing w:before="200" w:after="0"/>
+      </w:pPr>
+      <w:r>
+        <w:rPr>
+          <w:b/>
+          <w:sz w:val="17"/>
+        </w:rPr>
+        <w:t xml:space="preserve">¹ Supplemental Reporting: </w:t>
+      </w:r>
+      <w:r>
+        <w:rPr>
+          <w:sz w:val="17"/>
+        </w:rPr>
+        <w:t>Material under this heading is reconstructed from identified contemporaneous courtroom reporting or notes by a source other than Grant Smith Ellis. Attribution is provided with the supplement.</w:t>
       </w:r>
     </w:p>
     <w:sectPr>

</xml_diff>